<commit_message>
Fit every screen to the phone, calm the animations and fix keyboard and splash on Android
- Draw at the 390 design width and scale to the device; ignore system font scale
- Replace springs and layout animations with one gentle Appear
- Lift content and footer above the keyboard on edge-to-edge Android
- Put a full-screen touch layer over the splash video
- Ask before quitting an activity on hardware back; show quiz hints
- Add application figures and the device-fix notes to doc 12

Co-Authored-By: Claude Fable 5.1 <noreply@anthropic.com>
</commit_message>
<xml_diff>
--- a/docs/docx/12-원칙-점검과-보완.docx
+++ b/docs/docx/12-원칙-점검과-보완.docx
@@ -3729,6 +3729,365 @@
         <w:t>.</w:t>
       </w:r>
     </w:p>
+    <w:p>
+      <w:pPr>
+        <w:pStyle w:val="Heading1"/>
+      </w:pPr>
+      <w:r>
+        <w:t>7. 실제 폰에서 고친 것</w:t>
+      </w:r>
+    </w:p>
+    <w:p>
+      <w:r>
+        <w:t>갤럭시 노트에 깔아 써 보니 웹에서는 보이지 않던 문제가 나왔습니다. 모두 공통 부품에서 한 번에 고쳤습니다.</w:t>
+      </w:r>
+    </w:p>
+    <w:tbl>
+      <w:tblPr>
+        <w:tblStyle w:val="TableGrid"/>
+        <w:tblW w:type="auto" w:w="0"/>
+        <w:tblLook w:firstColumn="1" w:firstRow="1" w:lastColumn="0" w:lastRow="0" w:noHBand="0" w:noVBand="1" w:val="04A0"/>
+      </w:tblPr>
+      <w:tblGrid>
+        <w:gridCol w:w="3324"/>
+        <w:gridCol w:w="3324"/>
+        <w:gridCol w:w="3324"/>
+      </w:tblGrid>
+      <w:tr>
+        <w:tc>
+          <w:tcPr>
+            <w:tcW w:type="dxa" w:w="3324"/>
+            <w:shd w:val="clear" w:color="auto" w:fill="E9EFEB"/>
+          </w:tcPr>
+          <w:p>
+            <w:r>
+              <w:rPr>
+                <w:b/>
+              </w:rPr>
+            </w:r>
+            <w:r>
+              <w:rPr>
+                <w:b/>
+                <w:sz w:val="18"/>
+              </w:rPr>
+              <w:t>문제</w:t>
+            </w:r>
+          </w:p>
+        </w:tc>
+        <w:tc>
+          <w:tcPr>
+            <w:tcW w:type="dxa" w:w="3324"/>
+            <w:shd w:val="clear" w:color="auto" w:fill="E9EFEB"/>
+          </w:tcPr>
+          <w:p>
+            <w:r>
+              <w:rPr>
+                <w:b/>
+              </w:rPr>
+            </w:r>
+            <w:r>
+              <w:rPr>
+                <w:b/>
+                <w:sz w:val="18"/>
+              </w:rPr>
+              <w:t>원인</w:t>
+            </w:r>
+          </w:p>
+        </w:tc>
+        <w:tc>
+          <w:tcPr>
+            <w:tcW w:type="dxa" w:w="3324"/>
+            <w:shd w:val="clear" w:color="auto" w:fill="E9EFEB"/>
+          </w:tcPr>
+          <w:p>
+            <w:r>
+              <w:rPr>
+                <w:b/>
+              </w:rPr>
+            </w:r>
+            <w:r>
+              <w:rPr>
+                <w:b/>
+                <w:sz w:val="18"/>
+              </w:rPr>
+              <w:t>고친 방법</w:t>
+            </w:r>
+          </w:p>
+        </w:tc>
+      </w:tr>
+      <w:tr>
+        <w:tc>
+          <w:tcPr>
+            <w:tcW w:type="dxa" w:w="3324"/>
+          </w:tcPr>
+          <w:p>
+            <w:r/>
+            <w:r>
+              <w:rPr>
+                <w:sz w:val="18"/>
+              </w:rPr>
+              <w:t>글자가 커서 화면이 깨짐</w:t>
+            </w:r>
+          </w:p>
+        </w:tc>
+        <w:tc>
+          <w:tcPr>
+            <w:tcW w:type="dxa" w:w="3324"/>
+          </w:tcPr>
+          <w:p>
+            <w:r/>
+            <w:r>
+              <w:rPr>
+                <w:sz w:val="18"/>
+              </w:rPr>
+              <w:t>폰마다 화면 폭과 ‘글자 크기’ 설정이 다름</w:t>
+            </w:r>
+          </w:p>
+        </w:tc>
+        <w:tc>
+          <w:tcPr>
+            <w:tcW w:type="dxa" w:w="3324"/>
+          </w:tcPr>
+          <w:p>
+            <w:r/>
+            <w:r>
+              <w:rPr>
+                <w:b/>
+                <w:sz w:val="18"/>
+              </w:rPr>
+              <w:t>자동 맞춤</w:t>
+            </w:r>
+            <w:r>
+              <w:rPr>
+                <w:sz w:val="18"/>
+              </w:rPr>
+              <w:t>: 모든 화면을 디자인 폭 390 기준으로 그린 뒤 화면 폭에 맞춰 통째로 확대·축소(</w:t>
+            </w:r>
+            <w:r>
+              <w:rPr>
+                <w:rFonts w:ascii="Consolas" w:hAnsi="Consolas" w:eastAsia="Consolas"/>
+                <w:sz w:val="18"/>
+              </w:rPr>
+              <w:t>shared/ui/fit.tsx</w:t>
+            </w:r>
+            <w:r>
+              <w:rPr>
+                <w:sz w:val="18"/>
+              </w:rPr>
+              <w:t>). 시스템 글자 크기는 따르지 않음</w:t>
+            </w:r>
+          </w:p>
+        </w:tc>
+      </w:tr>
+      <w:tr>
+        <w:tc>
+          <w:tcPr>
+            <w:tcW w:type="dxa" w:w="3324"/>
+          </w:tcPr>
+          <w:p>
+            <w:r/>
+            <w:r>
+              <w:rPr>
+                <w:sz w:val="18"/>
+              </w:rPr>
+              <w:t>키보드가 입력 칸을 가림</w:t>
+            </w:r>
+          </w:p>
+        </w:tc>
+        <w:tc>
+          <w:tcPr>
+            <w:tcW w:type="dxa" w:w="3324"/>
+          </w:tcPr>
+          <w:p>
+            <w:r/>
+            <w:r>
+              <w:rPr>
+                <w:sz w:val="18"/>
+              </w:rPr>
+              <w:t>안드로이드 전체 화면 모드는 창 크기를 줄여 주지 않음</w:t>
+            </w:r>
+          </w:p>
+        </w:tc>
+        <w:tc>
+          <w:tcPr>
+            <w:tcW w:type="dxa" w:w="3324"/>
+          </w:tcPr>
+          <w:p>
+            <w:r/>
+            <w:r>
+              <w:rPr>
+                <w:sz w:val="18"/>
+              </w:rPr>
+              <w:t>키보드 높이를 직접 재서(</w:t>
+            </w:r>
+            <w:r>
+              <w:rPr>
+                <w:rFonts w:ascii="Consolas" w:hAnsi="Consolas" w:eastAsia="Consolas"/>
+                <w:sz w:val="18"/>
+              </w:rPr>
+              <w:t>useKeyboardHeight</w:t>
+            </w:r>
+            <w:r>
+              <w:rPr>
+                <w:sz w:val="18"/>
+              </w:rPr>
+              <w:t>) 화면을 그만큼 올리고, 입력 중인 칸이 보이게 스크롤. 아래 버튼도 키보드 위로 올라옴</w:t>
+            </w:r>
+          </w:p>
+        </w:tc>
+      </w:tr>
+      <w:tr>
+        <w:tc>
+          <w:tcPr>
+            <w:tcW w:type="dxa" w:w="3324"/>
+          </w:tcPr>
+          <w:p>
+            <w:r/>
+            <w:r>
+              <w:rPr>
+                <w:sz w:val="18"/>
+              </w:rPr>
+              <w:t>“좋아요!”, “그만할까요?” 창이 날아다님</w:t>
+            </w:r>
+          </w:p>
+        </w:tc>
+        <w:tc>
+          <w:tcPr>
+            <w:tcW w:type="dxa" w:w="3324"/>
+          </w:tcPr>
+          <w:p>
+            <w:r/>
+            <w:r>
+              <w:rPr>
+                <w:sz w:val="18"/>
+              </w:rPr>
+              <w:t>Reanimated 4에서 스프링 기본값이 바뀌어 크게 출렁임</w:t>
+            </w:r>
+          </w:p>
+        </w:tc>
+        <w:tc>
+          <w:tcPr>
+            <w:tcW w:type="dxa" w:w="3324"/>
+          </w:tcPr>
+          <w:p>
+            <w:r/>
+            <w:r>
+              <w:rPr>
+                <w:sz w:val="18"/>
+              </w:rPr>
+              <w:t xml:space="preserve">스프링과 등장·퇴장 효과를 모두 없애고 </w:t>
+            </w:r>
+            <w:r>
+              <w:rPr>
+                <w:rFonts w:ascii="Consolas" w:hAnsi="Consolas" w:eastAsia="Consolas"/>
+                <w:sz w:val="18"/>
+              </w:rPr>
+              <w:t>Appear</w:t>
+            </w:r>
+            <w:r>
+              <w:rPr>
+                <w:sz w:val="18"/>
+              </w:rPr>
+              <w:t xml:space="preserve"> 하나로 통일: 살짝 떠오르며 서서히 나타남(0.24초), 사라질 때는 효과 없음</w:t>
+            </w:r>
+          </w:p>
+        </w:tc>
+      </w:tr>
+      <w:tr>
+        <w:tc>
+          <w:tcPr>
+            <w:tcW w:type="dxa" w:w="3324"/>
+          </w:tcPr>
+          <w:p>
+            <w:r/>
+            <w:r>
+              <w:rPr>
+                <w:sz w:val="18"/>
+              </w:rPr>
+              <w:t>시작 영상에서 눌러도 안 넘어감</w:t>
+            </w:r>
+          </w:p>
+        </w:tc>
+        <w:tc>
+          <w:tcPr>
+            <w:tcW w:type="dxa" w:w="3324"/>
+          </w:tcPr>
+          <w:p>
+            <w:r/>
+            <w:r>
+              <w:rPr>
+                <w:sz w:val="18"/>
+              </w:rPr>
+              <w:t>영상 표면이 터치를 가로챔</w:t>
+            </w:r>
+          </w:p>
+        </w:tc>
+        <w:tc>
+          <w:tcPr>
+            <w:tcW w:type="dxa" w:w="3324"/>
+          </w:tcPr>
+          <w:p>
+            <w:r/>
+            <w:r>
+              <w:rPr>
+                <w:sz w:val="18"/>
+              </w:rPr>
+              <w:t>영상 위에 화면 전체 터치 층을 따로 두고, 손가락이 닿는 순간 넘어감</w:t>
+            </w:r>
+          </w:p>
+        </w:tc>
+      </w:tr>
+      <w:tr>
+        <w:tc>
+          <w:tcPr>
+            <w:tcW w:type="dxa" w:w="3324"/>
+          </w:tcPr>
+          <w:p>
+            <w:r/>
+            <w:r>
+              <w:rPr>
+                <w:sz w:val="18"/>
+              </w:rPr>
+              <w:t>놀이 중 뒤로 가기</w:t>
+            </w:r>
+          </w:p>
+        </w:tc>
+        <w:tc>
+          <w:tcPr>
+            <w:tcW w:type="dxa" w:w="3324"/>
+          </w:tcPr>
+          <w:p>
+            <w:r/>
+            <w:r>
+              <w:rPr>
+                <w:sz w:val="18"/>
+              </w:rPr>
+              <w:t>바로 나가 버림</w:t>
+            </w:r>
+          </w:p>
+        </w:tc>
+        <w:tc>
+          <w:tcPr>
+            <w:tcW w:type="dxa" w:w="3324"/>
+          </w:tcPr>
+          <w:p>
+            <w:r/>
+            <w:r>
+              <w:rPr>
+                <w:sz w:val="18"/>
+              </w:rPr>
+              <w:t>닫기 버튼과 똑같이 “그만할까요?”를 물음</w:t>
+            </w:r>
+          </w:p>
+        </w:tc>
+      </w:tr>
+    </w:tbl>
+    <w:p/>
+    <w:p>
+      <w:r>
+        <w:t>검증은 에뮬레이터를 노트와 같은 조건(1080×2280, 글자 크기 1.3배)으로 맞추고 가입부터 알림 시간까지 17개 화면을 돌며 확인했습니다. 홈 화면 위젯은 이번 범위에서 뺐습니다.</w:t>
+      </w:r>
+    </w:p>
     <w:sectPr>
       <w:pgSz w:w="12240" w:h="15840"/>
       <w:pgMar w:top="1134" w:right="1134" w:bottom="1134" w:left="1134" w:header="720" w:footer="720" w:gutter="0"/>

</xml_diff>

<commit_message>
Finish the in-app player on Android: stale clock, buffering, fullscreen hint
- Drop a listening run left behind when the app is killed mid-video (it used to auto-complete the routine)
- Treat buffering as started; show the fullscreen hint inside the sheet on Android
- Mark runs that happen outside in YouTube; document the player in doc 12

Co-Authored-By: Claude Fable 5.1 <noreply@anthropic.com>
</commit_message>
<xml_diff>
--- a/docs/docx/12-원칙-점검과-보완.docx
+++ b/docs/docx/12-원칙-점검과-보완.docx
@@ -4088,6 +4088,360 @@
         <w:t>검증은 에뮬레이터를 노트와 같은 조건(1080×2280, 글자 크기 1.3배)으로 맞추고 가입부터 알림 시간까지 17개 화면을 돌며 확인했습니다. 홈 화면 위젯은 이번 범위에서 뺐습니다.</w:t>
       </w:r>
     </w:p>
+    <w:p>
+      <w:pPr>
+        <w:pStyle w:val="Heading1"/>
+      </w:pPr>
+      <w:r>
+        <w:t>8. 앱 안에서 영상 보기</w:t>
+      </w:r>
+    </w:p>
+    <w:p>
+      <w:r>
+        <w:t>루틴 영상을 유튜브로 내보내지 않고 시트 안에서 재생합니다(결정 D-26).</w:t>
+      </w:r>
+    </w:p>
+    <w:tbl>
+      <w:tblPr>
+        <w:tblStyle w:val="TableGrid"/>
+        <w:tblW w:type="auto" w:w="0"/>
+        <w:tblLook w:firstColumn="1" w:firstRow="1" w:lastColumn="0" w:lastRow="0" w:noHBand="0" w:noVBand="1" w:val="04A0"/>
+      </w:tblPr>
+      <w:tblGrid>
+        <w:gridCol w:w="4986"/>
+        <w:gridCol w:w="4986"/>
+      </w:tblGrid>
+      <w:tr>
+        <w:tc>
+          <w:tcPr>
+            <w:tcW w:type="dxa" w:w="4986"/>
+            <w:shd w:val="clear" w:color="auto" w:fill="E9EFEB"/>
+          </w:tcPr>
+          <w:p>
+            <w:r>
+              <w:rPr>
+                <w:b/>
+              </w:rPr>
+            </w:r>
+            <w:r>
+              <w:rPr>
+                <w:b/>
+                <w:sz w:val="18"/>
+              </w:rPr>
+              <w:t>항목</w:t>
+            </w:r>
+          </w:p>
+        </w:tc>
+        <w:tc>
+          <w:tcPr>
+            <w:tcW w:type="dxa" w:w="4986"/>
+            <w:shd w:val="clear" w:color="auto" w:fill="E9EFEB"/>
+          </w:tcPr>
+          <w:p>
+            <w:r>
+              <w:rPr>
+                <w:b/>
+              </w:rPr>
+            </w:r>
+            <w:r>
+              <w:rPr>
+                <w:b/>
+                <w:sz w:val="18"/>
+              </w:rPr>
+              <w:t>내용</w:t>
+            </w:r>
+          </w:p>
+        </w:tc>
+      </w:tr>
+      <w:tr>
+        <w:tc>
+          <w:tcPr>
+            <w:tcW w:type="dxa" w:w="4986"/>
+          </w:tcPr>
+          <w:p>
+            <w:r/>
+            <w:r>
+              <w:rPr>
+                <w:sz w:val="18"/>
+              </w:rPr>
+              <w:t>구성</w:t>
+            </w:r>
+          </w:p>
+        </w:tc>
+        <w:tc>
+          <w:tcPr>
+            <w:tcW w:type="dxa" w:w="4986"/>
+          </w:tcPr>
+          <w:p>
+            <w:r/>
+            <w:r>
+              <w:rPr>
+                <w:rFonts w:ascii="Consolas" w:hAnsi="Consolas" w:eastAsia="Consolas"/>
+                <w:sz w:val="18"/>
+              </w:rPr>
+              <w:t>shared/platform/youtube</w:t>
+            </w:r>
+            <w:r>
+              <w:rPr>
+                <w:sz w:val="18"/>
+              </w:rPr>
+              <w:t xml:space="preserve">(웹은 IFrame API, 앱은 WebView) → </w:t>
+            </w:r>
+            <w:r>
+              <w:rPr>
+                <w:rFonts w:ascii="Consolas" w:hAnsi="Consolas" w:eastAsia="Consolas"/>
+                <w:sz w:val="18"/>
+              </w:rPr>
+              <w:t>useRoutinePlayback</w:t>
+            </w:r>
+            <w:r>
+              <w:rPr>
+                <w:sz w:val="18"/>
+              </w:rPr>
+              <w:t xml:space="preserve">(재생·시간·알림) → </w:t>
+            </w:r>
+            <w:r>
+              <w:rPr>
+                <w:rFonts w:ascii="Consolas" w:hAnsi="Consolas" w:eastAsia="Consolas"/>
+                <w:sz w:val="18"/>
+              </w:rPr>
+              <w:t>RoutinePlayer</w:t>
+            </w:r>
+            <w:r>
+              <w:rPr>
+                <w:sz w:val="18"/>
+              </w:rPr>
+              <w:t xml:space="preserve">(영상 칸) → </w:t>
+            </w:r>
+            <w:r>
+              <w:rPr>
+                <w:rFonts w:ascii="Consolas" w:hAnsi="Consolas" w:eastAsia="Consolas"/>
+                <w:sz w:val="18"/>
+              </w:rPr>
+              <w:t>RoutineSheet</w:t>
+            </w:r>
+            <w:r>
+              <w:rPr>
+                <w:sz w:val="18"/>
+              </w:rPr>
+              <w:t>(조립)</w:t>
+            </w:r>
+          </w:p>
+        </w:tc>
+      </w:tr>
+      <w:tr>
+        <w:tc>
+          <w:tcPr>
+            <w:tcW w:type="dxa" w:w="4986"/>
+          </w:tcPr>
+          <w:p>
+            <w:r/>
+            <w:r>
+              <w:rPr>
+                <w:sz w:val="18"/>
+              </w:rPr>
+              <w:t>듣기 시간</w:t>
+            </w:r>
+          </w:p>
+        </w:tc>
+        <w:tc>
+          <w:tcPr>
+            <w:tcW w:type="dxa" w:w="4986"/>
+          </w:tcPr>
+          <w:p>
+            <w:r/>
+            <w:r>
+              <w:rPr>
+                <w:sz w:val="18"/>
+              </w:rPr>
+              <w:t>영상이 재생되는 동안만 흐른다. 시트를 닫거나 앱을 내리면 영상과 함께 멈춘다</w:t>
+            </w:r>
+          </w:p>
+        </w:tc>
+      </w:tr>
+      <w:tr>
+        <w:tc>
+          <w:tcPr>
+            <w:tcW w:type="dxa" w:w="4986"/>
+          </w:tcPr>
+          <w:p>
+            <w:r/>
+            <w:r>
+              <w:rPr>
+                <w:sz w:val="18"/>
+              </w:rPr>
+              <w:t>멈춤 덮개</w:t>
+            </w:r>
+          </w:p>
+        </w:tc>
+        <w:tc>
+          <w:tcPr>
+            <w:tcW w:type="dxa" w:w="4986"/>
+          </w:tcPr>
+          <w:p>
+            <w:r/>
+            <w:r>
+              <w:rPr>
+                <w:sz w:val="18"/>
+              </w:rPr>
+              <w:t>멈추면 미리보기 그림과 큰 재생 버튼이 영상을 덮어 유튜브 추천 영상을 가린다</w:t>
+            </w:r>
+          </w:p>
+        </w:tc>
+      </w:tr>
+      <w:tr>
+        <w:tc>
+          <w:tcPr>
+            <w:tcW w:type="dxa" w:w="4986"/>
+          </w:tcPr>
+          <w:p>
+            <w:r/>
+            <w:r>
+              <w:rPr>
+                <w:sz w:val="18"/>
+              </w:rPr>
+              <w:t>자동재생이 막힐 때</w:t>
+            </w:r>
+          </w:p>
+        </w:tc>
+        <w:tc>
+          <w:tcPr>
+            <w:tcW w:type="dxa" w:w="4986"/>
+          </w:tcPr>
+          <w:p>
+            <w:r/>
+            <w:r>
+              <w:rPr>
+                <w:sz w:val="18"/>
+              </w:rPr>
+              <w:t>1.8초 안에 시작되지 않거나 9초 안에 준비되지 않으면 덮개를 걷어 유튜브의 재생 버튼을 직접 누르게 한다</w:t>
+            </w:r>
+          </w:p>
+        </w:tc>
+      </w:tr>
+      <w:tr>
+        <w:tc>
+          <w:tcPr>
+            <w:tcW w:type="dxa" w:w="4986"/>
+          </w:tcPr>
+          <w:p>
+            <w:r/>
+            <w:r>
+              <w:rPr>
+                <w:sz w:val="18"/>
+              </w:rPr>
+              <w:t>전체 화면</w:t>
+            </w:r>
+          </w:p>
+        </w:tc>
+        <w:tc>
+          <w:tcPr>
+            <w:tcW w:type="dxa" w:w="4986"/>
+          </w:tcPr>
+          <w:p>
+            <w:r/>
+            <w:r>
+              <w:rPr>
+                <w:sz w:val="18"/>
+              </w:rPr>
+              <w:t>웹은 제목 줄의 버튼으로 바로. 앱은 영상 안의 전체 화면 버튼으로 들어가며 항상 가로로 돈다(</w:t>
+            </w:r>
+            <w:r>
+              <w:rPr>
+                <w:rFonts w:ascii="Consolas" w:hAnsi="Consolas" w:eastAsia="Consolas"/>
+                <w:sz w:val="18"/>
+              </w:rPr>
+              <w:t>patches/react-native-webview</w:t>
+            </w:r>
+            <w:r>
+              <w:rPr>
+                <w:sz w:val="18"/>
+              </w:rPr>
+              <w:t>). 뒤로 가기로 나온다</w:t>
+            </w:r>
+          </w:p>
+        </w:tc>
+      </w:tr>
+      <w:tr>
+        <w:tc>
+          <w:tcPr>
+            <w:tcW w:type="dxa" w:w="4986"/>
+          </w:tcPr>
+          <w:p>
+            <w:r/>
+            <w:r>
+              <w:rPr>
+                <w:sz w:val="18"/>
+              </w:rPr>
+              <w:t>막힌 영상</w:t>
+            </w:r>
+          </w:p>
+        </w:tc>
+        <w:tc>
+          <w:tcPr>
+            <w:tcW w:type="dxa" w:w="4986"/>
+          </w:tcPr>
+          <w:p>
+            <w:r/>
+            <w:r>
+              <w:rPr>
+                <w:sz w:val="18"/>
+              </w:rPr>
+              <w:t>끼워 넣기를 허용하지 않는 영상은 “유튜브에서 열기”로 보내고 그동안만 시계로 시간을 잰다</w:t>
+            </w:r>
+          </w:p>
+        </w:tc>
+      </w:tr>
+      <w:tr>
+        <w:tc>
+          <w:tcPr>
+            <w:tcW w:type="dxa" w:w="4986"/>
+          </w:tcPr>
+          <w:p>
+            <w:r/>
+            <w:r>
+              <w:rPr>
+                <w:sz w:val="18"/>
+              </w:rPr>
+              <w:t>앱이 꺼졌을 때</w:t>
+            </w:r>
+          </w:p>
+        </w:tc>
+        <w:tc>
+          <w:tcPr>
+            <w:tcW w:type="dxa" w:w="4986"/>
+          </w:tcPr>
+          <w:p>
+            <w:r/>
+            <w:r>
+              <w:rPr>
+                <w:sz w:val="18"/>
+              </w:rPr>
+              <w:t>재생 중 앱이 꺼져 시계만 남아 돌던 구간은 다음에 열 때 버린다(</w:t>
+            </w:r>
+            <w:r>
+              <w:rPr>
+                <w:rFonts w:ascii="Consolas" w:hAnsi="Consolas" w:eastAsia="Consolas"/>
+                <w:sz w:val="18"/>
+              </w:rPr>
+              <w:t>dropStaleRun</w:t>
+            </w:r>
+            <w:r>
+              <w:rPr>
+                <w:sz w:val="18"/>
+              </w:rPr>
+              <w:t>). 고치기 전에는 이 시간이 쌓여 루틴이 저절로 완료됐다</w:t>
+            </w:r>
+          </w:p>
+        </w:tc>
+      </w:tr>
+    </w:tbl>
+    <w:p/>
+    <w:p>
+      <w:r>
+        <w:t>1주차 영상 네 편(Super Simple Songs 두 편, CoComelon, Vooks)은 웹과 안드로이드 에뮬레이터에서 모두 앱 안 재생을 확인했습니다.</w:t>
+      </w:r>
+    </w:p>
     <w:sectPr>
       <w:pgSz w:w="12240" w:h="15840"/>
       <w:pgMar w:top="1134" w:right="1134" w:bottom="1134" w:left="1134" w:header="720" w:footer="720" w:gutter="0"/>

</xml_diff>